<commit_message>
feat(BE): implement saga orchestrator and telemetry API
</commit_message>
<xml_diff>
--- a/docs/flow.docx
+++ b/docs/flow.docx
@@ -32,7 +32,6 @@
           <w:color w:val="1F1F1F"/>
           <w:sz w:val="28"/>
           <w:szCs w:val="28"/>
-          <w:bdr w:val="none" w:color="1F1F1F" w:sz="0" w:space="0"/>
         </w:rPr>
         <w:t xml:space="preserve">Luồng hoạt động của hệ thống </w:t>
       </w:r>
@@ -44,7 +43,6 @@
           <w:color w:val="1F1F1F"/>
           <w:sz w:val="28"/>
           <w:szCs w:val="28"/>
-          <w:bdr w:val="none" w:color="1F1F1F" w:sz="0" w:space="0"/>
         </w:rPr>
         <w:t>Global Supply Chain &amp; Asset Telemetry</w:t>
       </w:r>
@@ -54,7 +52,6 @@
           <w:color w:val="1F1F1F"/>
           <w:sz w:val="28"/>
           <w:szCs w:val="28"/>
-          <w:bdr w:val="none" w:color="1F1F1F" w:sz="0" w:space="0"/>
         </w:rPr>
         <w:t xml:space="preserve"> được thiết kế dựa trên sự kết hợp giữa tính nhất quán của SQL và khả năng mở rộng của NoSQL, thông qua mô hình điều phối </w:t>
       </w:r>
@@ -66,7 +63,6 @@
           <w:color w:val="1F1F1F"/>
           <w:sz w:val="28"/>
           <w:szCs w:val="28"/>
-          <w:bdr w:val="none" w:color="1F1F1F" w:sz="0" w:space="0"/>
         </w:rPr>
         <w:t>Saga</w:t>
       </w:r>
@@ -76,7 +72,6 @@
           <w:color w:val="1F1F1F"/>
           <w:sz w:val="28"/>
           <w:szCs w:val="28"/>
-          <w:bdr w:val="none" w:color="1F1F1F" w:sz="0" w:space="0"/>
         </w:rPr>
         <w:t>.</w:t>
       </w:r>
@@ -106,7 +101,6 @@
         <w:rPr>
           <w:rFonts w:hint="default" w:ascii="Times New Roman" w:hAnsi="Times New Roman" w:eastAsia="sans-serif" w:cs="Times New Roman"/>
           <w:color w:val="1F1F1F"/>
-          <w:bdr w:val="none" w:color="auto" w:sz="0" w:space="0"/>
         </w:rPr>
         <w:t>Dưới đây là mô tả chi tiết 3 quy trình cốt lõi của hệ thống:</w:t>
       </w:r>
@@ -137,7 +131,7 @@
           <w:color w:val="1F1F1F"/>
         </w:rPr>
         <w:pict>
-          <v:rect id="_x0000_i1030" o:spt="1" style="height:1.5pt;width:432pt;" fillcolor="#808080" filled="t" stroked="f" coordsize="21600,21600" o:hr="t" o:hrstd="t" o:hrnoshade="t" o:hralign="center">
+          <v:rect id="_x0000_i1025" o:spt="1" style="height:1.5pt;width:432pt;" fillcolor="#808080" filled="t" stroked="f" coordsize="21600,21600" o:hr="t" o:hrstd="t" o:hrnoshade="t" o:hralign="center">
             <v:path/>
             <v:fill on="t" focussize="0,0"/>
             <v:stroke on="f"/>
@@ -174,7 +168,6 @@
         <w:rPr>
           <w:rFonts w:hint="default" w:ascii="Times New Roman" w:hAnsi="Times New Roman" w:eastAsia="sans-serif" w:cs="Times New Roman"/>
           <w:color w:val="1F1F1F"/>
-          <w:bdr w:val="none" w:color="1F1F1F" w:sz="0" w:space="0"/>
         </w:rPr>
         <w:t>1. Luồng Giám sát &amp; Cảnh báo Tự động (Hybrid Logic)</w:t>
       </w:r>
@@ -213,7 +206,6 @@
         <w:rPr>
           <w:rFonts w:hint="default" w:ascii="Times New Roman" w:hAnsi="Times New Roman" w:eastAsia="sans-serif" w:cs="Times New Roman"/>
           <w:color w:val="1F1F1F"/>
-          <w:bdr w:val="none" w:color="1F1F1F" w:sz="0" w:space="0"/>
         </w:rPr>
         <w:t>Đây là luồng quan trọng nhất, kết nối dữ liệu IoT từ MongoDB sang trạng thái pháp lý trong SQL.</w:t>
       </w:r>
@@ -254,7 +246,6 @@
           <w:b/>
           <w:bCs/>
           <w:color w:val="1F1F1F"/>
-          <w:bdr w:val="none" w:color="1F1F1F" w:sz="0" w:space="0"/>
         </w:rPr>
         <w:t>Thu thập dữ liệu (Ingestion):</w:t>
       </w:r>
@@ -262,7 +253,6 @@
         <w:rPr>
           <w:rFonts w:hint="default" w:ascii="Times New Roman" w:hAnsi="Times New Roman" w:eastAsia="sans-serif" w:cs="Times New Roman"/>
           <w:color w:val="1F1F1F"/>
-          <w:bdr w:val="none" w:color="1F1F1F" w:sz="0" w:space="0"/>
         </w:rPr>
         <w:t xml:space="preserve"> Cảm biến IoT gửi luồng dữ liệu JSON (tọa độ, nhiệt độ, độ ẩm) về hệ thống.</w:t>
       </w:r>
@@ -303,7 +293,6 @@
           <w:b/>
           <w:bCs/>
           <w:color w:val="1F1F1F"/>
-          <w:bdr w:val="none" w:color="1F1F1F" w:sz="0" w:space="0"/>
         </w:rPr>
         <w:t>Lưu trữ NoSQL:</w:t>
       </w:r>
@@ -311,7 +300,6 @@
         <w:rPr>
           <w:rFonts w:hint="default" w:ascii="Times New Roman" w:hAnsi="Times New Roman" w:eastAsia="sans-serif" w:cs="Times New Roman"/>
           <w:color w:val="1F1F1F"/>
-          <w:bdr w:val="none" w:color="1F1F1F" w:sz="0" w:space="0"/>
         </w:rPr>
         <w:t xml:space="preserve"> Dữ liệu được ghi vào MongoDB collection </w:t>
       </w:r>
@@ -319,7 +307,6 @@
         <w:rPr>
           <w:rFonts w:hint="default" w:ascii="Times New Roman" w:hAnsi="Times New Roman" w:eastAsia="sans-serif" w:cs="Times New Roman"/>
           <w:color w:val="444746"/>
-          <w:bdr w:val="none" w:color="444746" w:sz="0" w:space="0"/>
         </w:rPr>
         <w:t>telemetry_logs</w:t>
       </w:r>
@@ -327,12 +314,9 @@
         <w:rPr>
           <w:rFonts w:hint="default" w:ascii="Times New Roman" w:hAnsi="Times New Roman" w:eastAsia="sans-serif" w:cs="Times New Roman"/>
           <w:color w:val="1F1F1F"/>
-          <w:bdr w:val="none" w:color="1F1F1F" w:sz="0" w:space="0"/>
         </w:rPr>
         <w:t xml:space="preserve"> dưới dạng append-only để làm bằng chứng pháp lý.</w:t>
       </w:r>
-      <w:bookmarkStart w:id="0" w:name="_GoBack"/>
-      <w:bookmarkEnd w:id="0"/>
     </w:p>
     <w:p>
       <w:pPr>
@@ -370,7 +354,6 @@
           <w:b/>
           <w:bCs/>
           <w:color w:val="1F1F1F"/>
-          <w:bdr w:val="none" w:color="1F1F1F" w:sz="0" w:space="0"/>
         </w:rPr>
         <w:t>Phát hiện vi phạm (Violation Detection):</w:t>
       </w:r>
@@ -378,7 +361,6 @@
         <w:rPr>
           <w:rFonts w:hint="default" w:ascii="Times New Roman" w:hAnsi="Times New Roman" w:eastAsia="sans-serif" w:cs="Times New Roman"/>
           <w:color w:val="1F1F1F"/>
-          <w:bdr w:val="none" w:color="1F1F1F" w:sz="0" w:space="0"/>
         </w:rPr>
         <w:t xml:space="preserve"> Lớp ứng dụng (Saga Orchestrator) kiểm tra giá trị nhiệt độ với ngưỡng an toàn (Threshold).</w:t>
       </w:r>
@@ -419,7 +401,6 @@
           <w:b/>
           <w:bCs/>
           <w:color w:val="1F1F1F"/>
-          <w:bdr w:val="none" w:color="1F1F1F" w:sz="0" w:space="0"/>
         </w:rPr>
         <w:t>Cập nhật trạng thái SQL:</w:t>
       </w:r>
@@ -427,7 +408,6 @@
         <w:rPr>
           <w:rFonts w:hint="default" w:ascii="Times New Roman" w:hAnsi="Times New Roman" w:eastAsia="sans-serif" w:cs="Times New Roman"/>
           <w:color w:val="1F1F1F"/>
-          <w:bdr w:val="none" w:color="1F1F1F" w:sz="0" w:space="0"/>
         </w:rPr>
         <w:t xml:space="preserve"> Nếu vi phạm, hệ thống gọi lệnh </w:t>
       </w:r>
@@ -435,7 +415,6 @@
         <w:rPr>
           <w:rFonts w:hint="default" w:ascii="Times New Roman" w:hAnsi="Times New Roman" w:eastAsia="sans-serif" w:cs="Times New Roman"/>
           <w:color w:val="444746"/>
-          <w:bdr w:val="none" w:color="444746" w:sz="0" w:space="0"/>
         </w:rPr>
         <w:t>UPDATE</w:t>
       </w:r>
@@ -443,7 +422,6 @@
         <w:rPr>
           <w:rFonts w:hint="default" w:ascii="Times New Roman" w:hAnsi="Times New Roman" w:eastAsia="sans-serif" w:cs="Times New Roman"/>
           <w:color w:val="1F1F1F"/>
-          <w:bdr w:val="none" w:color="1F1F1F" w:sz="0" w:space="0"/>
         </w:rPr>
         <w:t xml:space="preserve"> vào SQL Server để chuyển trạng thái </w:t>
       </w:r>
@@ -451,7 +429,6 @@
         <w:rPr>
           <w:rFonts w:hint="default" w:ascii="Times New Roman" w:hAnsi="Times New Roman" w:eastAsia="sans-serif" w:cs="Times New Roman"/>
           <w:color w:val="444746"/>
-          <w:bdr w:val="none" w:color="444746" w:sz="0" w:space="0"/>
         </w:rPr>
         <w:t>LastTelemetryStatus = 'VIOLATION'</w:t>
       </w:r>
@@ -459,7 +436,6 @@
         <w:rPr>
           <w:rFonts w:hint="default" w:ascii="Times New Roman" w:hAnsi="Times New Roman" w:eastAsia="sans-serif" w:cs="Times New Roman"/>
           <w:color w:val="1F1F1F"/>
-          <w:bdr w:val="none" w:color="1F1F1F" w:sz="0" w:space="0"/>
         </w:rPr>
         <w:t>.</w:t>
       </w:r>
@@ -500,7 +476,6 @@
           <w:b/>
           <w:bCs/>
           <w:color w:val="1F1F1F"/>
-          <w:bdr w:val="none" w:color="1F1F1F" w:sz="0" w:space="0"/>
         </w:rPr>
         <w:t>Kích hoạt Trigger:</w:t>
       </w:r>
@@ -508,7 +483,6 @@
         <w:rPr>
           <w:rFonts w:hint="default" w:ascii="Times New Roman" w:hAnsi="Times New Roman" w:eastAsia="sans-serif" w:cs="Times New Roman"/>
           <w:color w:val="1F1F1F"/>
-          <w:bdr w:val="none" w:color="1F1F1F" w:sz="0" w:space="0"/>
         </w:rPr>
         <w:t xml:space="preserve"> SQL Trigger </w:t>
       </w:r>
@@ -516,7 +490,6 @@
         <w:rPr>
           <w:rFonts w:hint="default" w:ascii="Times New Roman" w:hAnsi="Times New Roman" w:eastAsia="sans-serif" w:cs="Times New Roman"/>
           <w:color w:val="444746"/>
-          <w:bdr w:val="none" w:color="444746" w:sz="0" w:space="0"/>
         </w:rPr>
         <w:t>TRG_CHECK_VIOLATION</w:t>
       </w:r>
@@ -524,7 +497,6 @@
         <w:rPr>
           <w:rFonts w:hint="default" w:ascii="Times New Roman" w:hAnsi="Times New Roman" w:eastAsia="sans-serif" w:cs="Times New Roman"/>
           <w:color w:val="1F1F1F"/>
-          <w:bdr w:val="none" w:color="1F1F1F" w:sz="0" w:space="0"/>
         </w:rPr>
         <w:t xml:space="preserve"> tự động chuyển trạng thái lô hàng thành </w:t>
       </w:r>
@@ -532,7 +504,6 @@
         <w:rPr>
           <w:rFonts w:hint="default" w:ascii="Times New Roman" w:hAnsi="Times New Roman" w:eastAsia="sans-serif" w:cs="Times New Roman"/>
           <w:color w:val="444746"/>
-          <w:bdr w:val="none" w:color="444746" w:sz="0" w:space="0"/>
         </w:rPr>
         <w:t>ALARM</w:t>
       </w:r>
@@ -540,7 +511,6 @@
         <w:rPr>
           <w:rFonts w:hint="default" w:ascii="Times New Roman" w:hAnsi="Times New Roman" w:eastAsia="sans-serif" w:cs="Times New Roman"/>
           <w:color w:val="1F1F1F"/>
-          <w:bdr w:val="none" w:color="1F1F1F" w:sz="0" w:space="0"/>
         </w:rPr>
         <w:t>.</w:t>
       </w:r>
@@ -581,7 +551,6 @@
           <w:b/>
           <w:bCs/>
           <w:color w:val="1F1F1F"/>
-          <w:bdr w:val="none" w:color="1F1F1F" w:sz="0" w:space="0"/>
         </w:rPr>
         <w:t>Thông báo &amp; Khóa giao dịch:</w:t>
       </w:r>
@@ -589,7 +558,6 @@
         <w:rPr>
           <w:rFonts w:hint="default" w:ascii="Times New Roman" w:hAnsi="Times New Roman" w:eastAsia="sans-serif" w:cs="Times New Roman"/>
           <w:color w:val="1F1F1F"/>
-          <w:bdr w:val="none" w:color="1F1F1F" w:sz="0" w:space="0"/>
         </w:rPr>
         <w:t xml:space="preserve"> * Saga ghi sự kiện vào bảng </w:t>
       </w:r>
@@ -597,7 +565,6 @@
         <w:rPr>
           <w:rFonts w:hint="default" w:ascii="Times New Roman" w:hAnsi="Times New Roman" w:eastAsia="sans-serif" w:cs="Times New Roman"/>
           <w:color w:val="444746"/>
-          <w:bdr w:val="none" w:color="444746" w:sz="0" w:space="0"/>
         </w:rPr>
         <w:t>OutboxEvents</w:t>
       </w:r>
@@ -605,7 +572,6 @@
         <w:rPr>
           <w:rFonts w:hint="default" w:ascii="Times New Roman" w:hAnsi="Times New Roman" w:eastAsia="sans-serif" w:cs="Times New Roman"/>
           <w:color w:val="1F1F1F"/>
-          <w:bdr w:val="none" w:color="1F1F1F" w:sz="0" w:space="0"/>
         </w:rPr>
         <w:t xml:space="preserve"> để gửi thông báo Email/SMS cho chủ hàng.</w:t>
       </w:r>
@@ -644,7 +610,6 @@
         <w:rPr>
           <w:rFonts w:hint="default" w:ascii="Times New Roman" w:hAnsi="Times New Roman" w:eastAsia="sans-serif" w:cs="Times New Roman"/>
           <w:color w:val="1F1F1F"/>
-          <w:bdr w:val="none" w:color="1F1F1F" w:sz="0" w:space="0"/>
         </w:rPr>
         <w:t xml:space="preserve">Trigger </w:t>
       </w:r>
@@ -652,7 +617,6 @@
         <w:rPr>
           <w:rFonts w:hint="default" w:ascii="Times New Roman" w:hAnsi="Times New Roman" w:eastAsia="sans-serif" w:cs="Times New Roman"/>
           <w:color w:val="444746"/>
-          <w:bdr w:val="none" w:color="444746" w:sz="0" w:space="0"/>
         </w:rPr>
         <w:t>TRG_BLOCK_CUSTODY_WHEN_ALARM</w:t>
       </w:r>
@@ -660,7 +624,6 @@
         <w:rPr>
           <w:rFonts w:hint="default" w:ascii="Times New Roman" w:hAnsi="Times New Roman" w:eastAsia="sans-serif" w:cs="Times New Roman"/>
           <w:color w:val="1F1F1F"/>
-          <w:bdr w:val="none" w:color="1F1F1F" w:sz="0" w:space="0"/>
         </w:rPr>
         <w:t xml:space="preserve"> sẽ chặn mọi hành động chuyển giao quyền sở hữu cho đến khi sự cố được xử lý.</w:t>
       </w:r>
@@ -691,7 +654,7 @@
           <w:color w:val="1F1F1F"/>
         </w:rPr>
         <w:pict>
-          <v:rect id="_x0000_i1031" o:spt="1" style="height:1.5pt;width:432pt;" fillcolor="#808080" filled="t" stroked="f" coordsize="21600,21600" o:hr="t" o:hrstd="t" o:hrnoshade="t" o:hralign="center">
+          <v:rect id="_x0000_i1026" o:spt="1" style="height:1.5pt;width:432pt;" fillcolor="#808080" filled="t" stroked="f" coordsize="21600,21600" o:hr="t" o:hrstd="t" o:hrnoshade="t" o:hralign="center">
             <v:path/>
             <v:fill on="t" focussize="0,0"/>
             <v:stroke on="f"/>
@@ -729,7 +692,6 @@
         <w:rPr>
           <w:rFonts w:hint="default" w:ascii="Times New Roman" w:hAnsi="Times New Roman" w:eastAsia="sans-serif" w:cs="Times New Roman"/>
           <w:color w:val="1F1F1F"/>
-          <w:bdr w:val="none" w:color="1F1F1F" w:sz="0" w:space="0"/>
         </w:rPr>
         <w:t>2. Luồng Chuyển giao Trách nhiệm (Chain of Custody)</w:t>
       </w:r>
@@ -767,7 +729,6 @@
         <w:rPr>
           <w:rFonts w:hint="default" w:ascii="Times New Roman" w:hAnsi="Times New Roman" w:eastAsia="sans-serif" w:cs="Times New Roman"/>
           <w:color w:val="1F1F1F"/>
-          <w:bdr w:val="none" w:color="1F1F1F" w:sz="0" w:space="0"/>
         </w:rPr>
         <w:t>Luồng này đảm bảo tính minh bạch về pháp lý tại mọi thời điểm.</w:t>
       </w:r>
@@ -807,7 +768,6 @@
           <w:b/>
           <w:bCs/>
           <w:color w:val="1F1F1F"/>
-          <w:bdr w:val="none" w:color="1F1F1F" w:sz="0" w:space="0"/>
         </w:rPr>
         <w:t>Yêu cầu bàn giao:</w:t>
       </w:r>
@@ -815,7 +775,6 @@
         <w:rPr>
           <w:rFonts w:hint="default" w:ascii="Times New Roman" w:hAnsi="Times New Roman" w:eastAsia="sans-serif" w:cs="Times New Roman"/>
           <w:color w:val="1F1F1F"/>
-          <w:bdr w:val="none" w:color="1F1F1F" w:sz="0" w:space="0"/>
         </w:rPr>
         <w:t xml:space="preserve"> Khi container đến cảng hoặc kho mới, bên nhận yêu cầu thực hiện </w:t>
       </w:r>
@@ -823,7 +782,6 @@
         <w:rPr>
           <w:rFonts w:hint="default" w:ascii="Times New Roman" w:hAnsi="Times New Roman" w:eastAsia="sans-serif" w:cs="Times New Roman"/>
           <w:color w:val="444746"/>
-          <w:bdr w:val="none" w:color="444746" w:sz="0" w:space="0"/>
         </w:rPr>
         <w:t>Change of Custody</w:t>
       </w:r>
@@ -831,7 +789,6 @@
         <w:rPr>
           <w:rFonts w:hint="default" w:ascii="Times New Roman" w:hAnsi="Times New Roman" w:eastAsia="sans-serif" w:cs="Times New Roman"/>
           <w:color w:val="1F1F1F"/>
-          <w:bdr w:val="none" w:color="1F1F1F" w:sz="0" w:space="0"/>
         </w:rPr>
         <w:t>.</w:t>
       </w:r>
@@ -862,16 +819,17 @@
         <w:jc w:val="both"/>
         <w:rPr>
           <w:rFonts w:hint="default" w:ascii="Times New Roman" w:hAnsi="Times New Roman" w:eastAsia="sans-serif" w:cs="Times New Roman"/>
-          <w:color w:val="1F1F1F"/>
-        </w:rPr>
-      </w:pPr>
-      <w:r>
-        <w:rPr>
-          <w:rFonts w:hint="default" w:ascii="Times New Roman" w:hAnsi="Times New Roman" w:eastAsia="sans-serif" w:cs="Times New Roman"/>
           <w:b/>
           <w:bCs/>
           <w:color w:val="1F1F1F"/>
-          <w:bdr w:val="none" w:color="1F1F1F" w:sz="0" w:space="0"/>
+        </w:rPr>
+      </w:pPr>
+      <w:r>
+        <w:rPr>
+          <w:rFonts w:hint="default" w:ascii="Times New Roman" w:hAnsi="Times New Roman" w:eastAsia="sans-serif" w:cs="Times New Roman"/>
+          <w:b/>
+          <w:bCs/>
+          <w:color w:val="1F1F1F"/>
         </w:rPr>
         <w:t>Thực thi Transaction:</w:t>
       </w:r>
@@ -879,23 +837,33 @@
         <w:rPr>
           <w:rFonts w:hint="default" w:ascii="Times New Roman" w:hAnsi="Times New Roman" w:eastAsia="sans-serif" w:cs="Times New Roman"/>
           <w:color w:val="1F1F1F"/>
-          <w:bdr w:val="none" w:color="1F1F1F" w:sz="0" w:space="0"/>
-        </w:rPr>
-        <w:t xml:space="preserve"> Hệ thống gọi Stored Procedure </w:t>
-      </w:r>
-      <w:r>
-        <w:rPr>
-          <w:rFonts w:hint="default" w:ascii="Times New Roman" w:hAnsi="Times New Roman" w:eastAsia="sans-serif" w:cs="Times New Roman"/>
+        </w:rPr>
+        <w:t xml:space="preserve"> Hệ thống gọi </w:t>
+      </w:r>
+      <w:r>
+        <w:rPr>
+          <w:rFonts w:hint="default" w:ascii="Times New Roman" w:hAnsi="Times New Roman" w:eastAsia="sans-serif" w:cs="Times New Roman"/>
+          <w:b/>
+          <w:bCs/>
+          <w:color w:val="1F1F1F"/>
+        </w:rPr>
+        <w:t xml:space="preserve">Stored Procedure </w:t>
+      </w:r>
+      <w:r>
+        <w:rPr>
+          <w:rFonts w:hint="default" w:ascii="Times New Roman" w:hAnsi="Times New Roman" w:eastAsia="sans-serif" w:cs="Times New Roman"/>
+          <w:b/>
+          <w:bCs/>
           <w:color w:val="444746"/>
-          <w:bdr w:val="none" w:color="444746" w:sz="0" w:space="0"/>
         </w:rPr>
         <w:t>sp_change_custody</w:t>
       </w:r>
       <w:r>
         <w:rPr>
           <w:rFonts w:hint="default" w:ascii="Times New Roman" w:hAnsi="Times New Roman" w:eastAsia="sans-serif" w:cs="Times New Roman"/>
-          <w:color w:val="1F1F1F"/>
-          <w:bdr w:val="none" w:color="1F1F1F" w:sz="0" w:space="0"/>
+          <w:b/>
+          <w:bCs/>
+          <w:color w:val="1F1F1F"/>
         </w:rPr>
         <w:t xml:space="preserve"> trong SQL Server.</w:t>
       </w:r>
@@ -935,10 +903,11 @@
           <w:b/>
           <w:bCs/>
           <w:color w:val="1F1F1F"/>
-          <w:bdr w:val="none" w:color="1F1F1F" w:sz="0" w:space="0"/>
         </w:rPr>
         <w:t>Kiểm tra điều kiện:</w:t>
       </w:r>
+      <w:bookmarkStart w:id="0" w:name="_GoBack"/>
+      <w:bookmarkEnd w:id="0"/>
     </w:p>
     <w:p>
       <w:pPr>
@@ -973,7 +942,6 @@
         <w:rPr>
           <w:rFonts w:hint="default" w:ascii="Times New Roman" w:hAnsi="Times New Roman" w:eastAsia="sans-serif" w:cs="Times New Roman"/>
           <w:color w:val="1F1F1F"/>
-          <w:bdr w:val="none" w:color="1F1F1F" w:sz="0" w:space="0"/>
         </w:rPr>
         <w:t>Xác nhận bên chuyển giao có đúng là chủ sở hữu hiện tại không.</w:t>
       </w:r>
@@ -1011,7 +979,6 @@
         <w:rPr>
           <w:rFonts w:hint="default" w:ascii="Times New Roman" w:hAnsi="Times New Roman" w:eastAsia="sans-serif" w:cs="Times New Roman"/>
           <w:color w:val="1F1F1F"/>
-          <w:bdr w:val="none" w:color="1F1F1F" w:sz="0" w:space="0"/>
         </w:rPr>
         <w:t>Kiểm tra lô hàng có đang bị khóa (</w:t>
       </w:r>
@@ -1019,7 +986,6 @@
         <w:rPr>
           <w:rFonts w:hint="default" w:ascii="Times New Roman" w:hAnsi="Times New Roman" w:eastAsia="sans-serif" w:cs="Times New Roman"/>
           <w:color w:val="444746"/>
-          <w:bdr w:val="none" w:color="444746" w:sz="0" w:space="0"/>
         </w:rPr>
         <w:t>ALARM</w:t>
       </w:r>
@@ -1027,7 +993,6 @@
         <w:rPr>
           <w:rFonts w:hint="default" w:ascii="Times New Roman" w:hAnsi="Times New Roman" w:eastAsia="sans-serif" w:cs="Times New Roman"/>
           <w:color w:val="1F1F1F"/>
-          <w:bdr w:val="none" w:color="1F1F1F" w:sz="0" w:space="0"/>
         </w:rPr>
         <w:t>) hay không.</w:t>
       </w:r>
@@ -1067,7 +1032,6 @@
           <w:b/>
           <w:bCs/>
           <w:color w:val="1F1F1F"/>
-          <w:bdr w:val="none" w:color="1F1F1F" w:sz="0" w:space="0"/>
         </w:rPr>
         <w:t>Cập nhật nguyên tử (Atomic Update):</w:t>
       </w:r>
@@ -1105,7 +1069,6 @@
         <w:rPr>
           <w:rFonts w:hint="default" w:ascii="Times New Roman" w:hAnsi="Times New Roman" w:eastAsia="sans-serif" w:cs="Times New Roman"/>
           <w:color w:val="1F1F1F"/>
-          <w:bdr w:val="none" w:color="1F1F1F" w:sz="0" w:space="0"/>
         </w:rPr>
         <w:t>Kết thúc quyền sở hữu của bên cũ (</w:t>
       </w:r>
@@ -1113,7 +1076,6 @@
         <w:rPr>
           <w:rFonts w:hint="default" w:ascii="Times New Roman" w:hAnsi="Times New Roman" w:eastAsia="sans-serif" w:cs="Times New Roman"/>
           <w:color w:val="444746"/>
-          <w:bdr w:val="none" w:color="444746" w:sz="0" w:space="0"/>
         </w:rPr>
         <w:t>EndTime</w:t>
       </w:r>
@@ -1121,7 +1083,6 @@
         <w:rPr>
           <w:rFonts w:hint="default" w:ascii="Times New Roman" w:hAnsi="Times New Roman" w:eastAsia="sans-serif" w:cs="Times New Roman"/>
           <w:color w:val="1F1F1F"/>
-          <w:bdr w:val="none" w:color="1F1F1F" w:sz="0" w:space="0"/>
         </w:rPr>
         <w:t>).</w:t>
       </w:r>
@@ -1159,7 +1120,6 @@
         <w:rPr>
           <w:rFonts w:hint="default" w:ascii="Times New Roman" w:hAnsi="Times New Roman" w:eastAsia="sans-serif" w:cs="Times New Roman"/>
           <w:color w:val="1F1F1F"/>
-          <w:bdr w:val="none" w:color="1F1F1F" w:sz="0" w:space="0"/>
         </w:rPr>
         <w:t>Tạo bản ghi sở hữu mới cho bên nhận.</w:t>
       </w:r>
@@ -1197,7 +1157,6 @@
         <w:rPr>
           <w:rFonts w:hint="default" w:ascii="Times New Roman" w:hAnsi="Times New Roman" w:eastAsia="sans-serif" w:cs="Times New Roman"/>
           <w:color w:val="1F1F1F"/>
-          <w:bdr w:val="none" w:color="1F1F1F" w:sz="0" w:space="0"/>
         </w:rPr>
         <w:t>Cập nhật vị trí hiện tại (</w:t>
       </w:r>
@@ -1205,7 +1164,6 @@
         <w:rPr>
           <w:rFonts w:hint="default" w:ascii="Times New Roman" w:hAnsi="Times New Roman" w:eastAsia="sans-serif" w:cs="Times New Roman"/>
           <w:color w:val="444746"/>
-          <w:bdr w:val="none" w:color="444746" w:sz="0" w:space="0"/>
         </w:rPr>
         <w:t>CurrentPortID</w:t>
       </w:r>
@@ -1213,7 +1171,6 @@
         <w:rPr>
           <w:rFonts w:hint="default" w:ascii="Times New Roman" w:hAnsi="Times New Roman" w:eastAsia="sans-serif" w:cs="Times New Roman"/>
           <w:color w:val="1F1F1F"/>
-          <w:bdr w:val="none" w:color="1F1F1F" w:sz="0" w:space="0"/>
         </w:rPr>
         <w:t>) của lô hàng.</w:t>
       </w:r>
@@ -1253,7 +1210,6 @@
           <w:b/>
           <w:bCs/>
           <w:color w:val="1F1F1F"/>
-          <w:bdr w:val="none" w:color="1F1F1F" w:sz="0" w:space="0"/>
         </w:rPr>
         <w:t>Hoàn tất:</w:t>
       </w:r>
@@ -1261,7 +1217,6 @@
         <w:rPr>
           <w:rFonts w:hint="default" w:ascii="Times New Roman" w:hAnsi="Times New Roman" w:eastAsia="sans-serif" w:cs="Times New Roman"/>
           <w:color w:val="1F1F1F"/>
-          <w:bdr w:val="none" w:color="1F1F1F" w:sz="0" w:space="0"/>
         </w:rPr>
         <w:t xml:space="preserve"> </w:t>
       </w:r>
@@ -1269,7 +1224,6 @@
         <w:rPr>
           <w:rFonts w:hint="default" w:ascii="Times New Roman" w:hAnsi="Times New Roman" w:eastAsia="sans-serif" w:cs="Times New Roman"/>
           <w:color w:val="444746"/>
-          <w:bdr w:val="none" w:color="444746" w:sz="0" w:space="0"/>
         </w:rPr>
         <w:t>COMMIT</w:t>
       </w:r>
@@ -1277,7 +1231,6 @@
         <w:rPr>
           <w:rFonts w:hint="default" w:ascii="Times New Roman" w:hAnsi="Times New Roman" w:eastAsia="sans-serif" w:cs="Times New Roman"/>
           <w:color w:val="1F1F1F"/>
-          <w:bdr w:val="none" w:color="1F1F1F" w:sz="0" w:space="0"/>
         </w:rPr>
         <w:t xml:space="preserve"> giao dịch để ghi nhận lịch sử pháp lý hoặc </w:t>
       </w:r>
@@ -1285,7 +1238,6 @@
         <w:rPr>
           <w:rFonts w:hint="default" w:ascii="Times New Roman" w:hAnsi="Times New Roman" w:eastAsia="sans-serif" w:cs="Times New Roman"/>
           <w:color w:val="444746"/>
-          <w:bdr w:val="none" w:color="444746" w:sz="0" w:space="0"/>
         </w:rPr>
         <w:t>ROLLBACK</w:t>
       </w:r>
@@ -1293,7 +1245,6 @@
         <w:rPr>
           <w:rFonts w:hint="default" w:ascii="Times New Roman" w:hAnsi="Times New Roman" w:eastAsia="sans-serif" w:cs="Times New Roman"/>
           <w:color w:val="1F1F1F"/>
-          <w:bdr w:val="none" w:color="1F1F1F" w:sz="0" w:space="0"/>
         </w:rPr>
         <w:t xml:space="preserve"> nếu có bất kỳ sai sót nào.</w:t>
       </w:r>
@@ -1324,7 +1275,7 @@
           <w:color w:val="1F1F1F"/>
         </w:rPr>
         <w:pict>
-          <v:rect id="_x0000_i1032" o:spt="1" style="height:1.5pt;width:432pt;" fillcolor="#808080" filled="t" stroked="f" coordsize="21600,21600" o:hr="t" o:hrstd="t" o:hrnoshade="t" o:hralign="center">
+          <v:rect id="_x0000_i1027" o:spt="1" style="height:1.5pt;width:432pt;" fillcolor="#808080" filled="t" stroked="f" coordsize="21600,21600" o:hr="t" o:hrstd="t" o:hrnoshade="t" o:hralign="center">
             <v:path/>
             <v:fill on="t" focussize="0,0"/>
             <v:stroke on="f"/>
@@ -1382,7 +1333,6 @@
         <w:rPr>
           <w:rFonts w:hint="default" w:ascii="Times New Roman" w:hAnsi="Times New Roman" w:eastAsia="sans-serif" w:cs="Times New Roman"/>
           <w:color w:val="1F1F1F"/>
-          <w:bdr w:val="none" w:color="1F1F1F" w:sz="0" w:space="0"/>
         </w:rPr>
         <w:t>3. Luồng Truy vấn &amp; Phân tích (Analytics)</w:t>
       </w:r>
@@ -1412,7 +1362,6 @@
         <w:rPr>
           <w:rFonts w:hint="default" w:ascii="Times New Roman" w:hAnsi="Times New Roman" w:eastAsia="sans-serif" w:cs="Times New Roman"/>
           <w:color w:val="1F1F1F"/>
-          <w:bdr w:val="none" w:color="1F1F1F" w:sz="0" w:space="0"/>
         </w:rPr>
         <w:t>Sử dụng sức mạnh của MongoDB Aggregation để hỗ trợ ra quyết định.</w:t>
       </w:r>
@@ -1452,7 +1401,6 @@
           <w:b/>
           <w:bCs/>
           <w:color w:val="1F1F1F"/>
-          <w:bdr w:val="none" w:color="1F1F1F" w:sz="0" w:space="0"/>
         </w:rPr>
         <w:t>Truy vết hành trình (Trace Route):</w:t>
       </w:r>
@@ -1460,7 +1408,6 @@
         <w:rPr>
           <w:rFonts w:hint="default" w:ascii="Times New Roman" w:hAnsi="Times New Roman" w:eastAsia="sans-serif" w:cs="Times New Roman"/>
           <w:color w:val="1F1F1F"/>
-          <w:bdr w:val="none" w:color="1F1F1F" w:sz="0" w:space="0"/>
         </w:rPr>
         <w:t xml:space="preserve"> * Hệ thống quét dữ liệu từ MongoDB theo </w:t>
       </w:r>
@@ -1468,7 +1415,6 @@
         <w:rPr>
           <w:rFonts w:hint="default" w:ascii="Times New Roman" w:hAnsi="Times New Roman" w:eastAsia="sans-serif" w:cs="Times New Roman"/>
           <w:color w:val="444746"/>
-          <w:bdr w:val="none" w:color="444746" w:sz="0" w:space="0"/>
         </w:rPr>
         <w:t>ShipmentID</w:t>
       </w:r>
@@ -1476,7 +1422,6 @@
         <w:rPr>
           <w:rFonts w:hint="default" w:ascii="Times New Roman" w:hAnsi="Times New Roman" w:eastAsia="sans-serif" w:cs="Times New Roman"/>
           <w:color w:val="1F1F1F"/>
-          <w:bdr w:val="none" w:color="1F1F1F" w:sz="0" w:space="0"/>
         </w:rPr>
         <w:t>.</w:t>
       </w:r>
@@ -1514,7 +1459,6 @@
         <w:rPr>
           <w:rFonts w:hint="default" w:ascii="Times New Roman" w:hAnsi="Times New Roman" w:eastAsia="sans-serif" w:cs="Times New Roman"/>
           <w:color w:val="1F1F1F"/>
-          <w:bdr w:val="none" w:color="1F1F1F" w:sz="0" w:space="0"/>
         </w:rPr>
         <w:t xml:space="preserve">Sắp xếp mảng </w:t>
       </w:r>
@@ -1522,7 +1466,6 @@
         <w:rPr>
           <w:rFonts w:hint="default" w:ascii="Times New Roman" w:hAnsi="Times New Roman" w:eastAsia="sans-serif" w:cs="Times New Roman"/>
           <w:color w:val="444746"/>
-          <w:bdr w:val="none" w:color="444746" w:sz="0" w:space="0"/>
         </w:rPr>
         <w:t>logs</w:t>
       </w:r>
@@ -1530,7 +1473,6 @@
         <w:rPr>
           <w:rFonts w:hint="default" w:ascii="Times New Roman" w:hAnsi="Times New Roman" w:eastAsia="sans-serif" w:cs="Times New Roman"/>
           <w:color w:val="1F1F1F"/>
-          <w:bdr w:val="none" w:color="1F1F1F" w:sz="0" w:space="0"/>
         </w:rPr>
         <w:t xml:space="preserve"> theo thời gian tăng dần để vẽ bản đồ đường đi thực tế.</w:t>
       </w:r>
@@ -1570,7 +1512,6 @@
           <w:b/>
           <w:bCs/>
           <w:color w:val="1F1F1F"/>
-          <w:bdr w:val="none" w:color="1F1F1F" w:sz="0" w:space="0"/>
         </w:rPr>
         <w:t>Truy vết lịch sử sở hữu (Custody Chain):</w:t>
       </w:r>
@@ -1578,7 +1519,6 @@
         <w:rPr>
           <w:rFonts w:hint="default" w:ascii="Times New Roman" w:hAnsi="Times New Roman" w:eastAsia="sans-serif" w:cs="Times New Roman"/>
           <w:color w:val="1F1F1F"/>
-          <w:bdr w:val="none" w:color="1F1F1F" w:sz="0" w:space="0"/>
         </w:rPr>
         <w:t xml:space="preserve"> Sử dụng </w:t>
       </w:r>
@@ -1588,7 +1528,6 @@
           <w:b/>
           <w:bCs/>
           <w:color w:val="1F1F1F"/>
-          <w:bdr w:val="none" w:color="1F1F1F" w:sz="0" w:space="0"/>
         </w:rPr>
         <w:t>Recursive CTE</w:t>
       </w:r>
@@ -1596,7 +1535,6 @@
         <w:rPr>
           <w:rFonts w:hint="default" w:ascii="Times New Roman" w:hAnsi="Times New Roman" w:eastAsia="sans-serif" w:cs="Times New Roman"/>
           <w:color w:val="1F1F1F"/>
-          <w:bdr w:val="none" w:color="1F1F1F" w:sz="0" w:space="0"/>
         </w:rPr>
         <w:t xml:space="preserve"> trong SQL để dựng lại cây phả hệ các bên đã chịu trách nhiệm cho lô hàng từ lúc khởi tạo.</w:t>
       </w:r>
@@ -1636,7 +1574,6 @@
           <w:b/>
           <w:bCs/>
           <w:color w:val="1F1F1F"/>
-          <w:bdr w:val="none" w:color="1F1F1F" w:sz="0" w:space="0"/>
         </w:rPr>
         <w:t>Tối ưu lộ trình (Route Optimization):</w:t>
       </w:r>
@@ -1644,7 +1581,6 @@
         <w:rPr>
           <w:rFonts w:hint="default" w:ascii="Times New Roman" w:hAnsi="Times New Roman" w:eastAsia="sans-serif" w:cs="Times New Roman"/>
           <w:color w:val="1F1F1F"/>
-          <w:bdr w:val="none" w:color="1F1F1F" w:sz="0" w:space="0"/>
         </w:rPr>
         <w:t xml:space="preserve"> * Dùng </w:t>
       </w:r>
@@ -1654,7 +1590,6 @@
           <w:b/>
           <w:bCs/>
           <w:color w:val="1F1F1F"/>
-          <w:bdr w:val="none" w:color="1F1F1F" w:sz="0" w:space="0"/>
         </w:rPr>
         <w:t>Graph-lookup/Aggregation</w:t>
       </w:r>
@@ -1662,7 +1597,6 @@
         <w:rPr>
           <w:rFonts w:hint="default" w:ascii="Times New Roman" w:hAnsi="Times New Roman" w:eastAsia="sans-serif" w:cs="Times New Roman"/>
           <w:color w:val="1F1F1F"/>
-          <w:bdr w:val="none" w:color="1F1F1F" w:sz="0" w:space="0"/>
         </w:rPr>
         <w:t xml:space="preserve"> để tìm tất cả các lô hàng đã đi từ Cảng A đến Cảng B trong quá khứ.</w:t>
       </w:r>
@@ -1700,7 +1634,6 @@
         <w:rPr>
           <w:rFonts w:hint="default" w:ascii="Times New Roman" w:hAnsi="Times New Roman" w:eastAsia="sans-serif" w:cs="Times New Roman"/>
           <w:color w:val="1F1F1F"/>
-          <w:bdr w:val="none" w:color="1F1F1F" w:sz="0" w:space="0"/>
         </w:rPr>
         <w:t xml:space="preserve">Tính toán thời gian di chuyển trung bình và loại bỏ các tuyến đường thường xuyên bị cảnh báo </w:t>
       </w:r>
@@ -1708,7 +1641,6 @@
         <w:rPr>
           <w:rFonts w:hint="default" w:ascii="Times New Roman" w:hAnsi="Times New Roman" w:eastAsia="sans-serif" w:cs="Times New Roman"/>
           <w:color w:val="444746"/>
-          <w:bdr w:val="none" w:color="444746" w:sz="0" w:space="0"/>
         </w:rPr>
         <w:t>ALARM</w:t>
       </w:r>
@@ -1716,7 +1648,6 @@
         <w:rPr>
           <w:rFonts w:hint="default" w:ascii="Times New Roman" w:hAnsi="Times New Roman" w:eastAsia="sans-serif" w:cs="Times New Roman"/>
           <w:color w:val="1F1F1F"/>
-          <w:bdr w:val="none" w:color="1F1F1F" w:sz="0" w:space="0"/>
         </w:rPr>
         <w:t>.</w:t>
       </w:r>
@@ -1754,7 +1685,6 @@
         <w:rPr>
           <w:rFonts w:hint="default" w:ascii="Times New Roman" w:hAnsi="Times New Roman" w:eastAsia="sans-serif" w:cs="Times New Roman"/>
           <w:color w:val="1F1F1F"/>
-          <w:bdr w:val="none" w:color="1F1F1F" w:sz="0" w:space="0"/>
         </w:rPr>
         <w:t>Gợi ý lộ trình tối ưu cho lô hàng mới.</w:t>
       </w:r>
@@ -1785,7 +1715,7 @@
           <w:color w:val="1F1F1F"/>
         </w:rPr>
         <w:pict>
-          <v:rect id="_x0000_i1033" o:spt="1" style="height:1.5pt;width:432pt;" fillcolor="#808080" filled="t" stroked="f" coordsize="21600,21600" o:hr="t" o:hrstd="t" o:hrnoshade="t" o:hralign="center">
+          <v:rect id="_x0000_i1028" o:spt="1" style="height:1.5pt;width:432pt;" fillcolor="#808080" filled="t" stroked="f" coordsize="21600,21600" o:hr="t" o:hrstd="t" o:hrnoshade="t" o:hralign="center">
             <v:path/>
             <v:fill on="t" focussize="0,0"/>
             <v:stroke on="f"/>
@@ -1824,7 +1754,6 @@
           <w:b/>
           <w:bCs/>
           <w:color w:val="1F1F1F"/>
-          <w:bdr w:val="none" w:color="1F1F1F" w:sz="0" w:space="0"/>
         </w:rPr>
         <w:t>Bước tiếp theo:</w:t>
       </w:r>
@@ -1832,7 +1761,6 @@
         <w:rPr>
           <w:rFonts w:hint="default" w:ascii="Times New Roman" w:hAnsi="Times New Roman" w:eastAsia="sans-serif" w:cs="Times New Roman"/>
           <w:color w:val="1F1F1F"/>
-          <w:bdr w:val="none" w:color="auto" w:sz="0" w:space="0"/>
         </w:rPr>
         <w:t xml:space="preserve"> Bạn có muốn tôi thiết kế chi tiết các bảng SQL (</w:t>
       </w:r>
@@ -1841,7 +1769,6 @@
           <w:rStyle w:val="8"/>
           <w:rFonts w:hint="default" w:ascii="Times New Roman" w:hAnsi="Times New Roman" w:eastAsia="sans-serif" w:cs="Times New Roman"/>
           <w:color w:val="444746"/>
-          <w:bdr w:val="none" w:color="444746" w:sz="0" w:space="0"/>
         </w:rPr>
         <w:t>Shipments</w:t>
       </w:r>
@@ -1849,7 +1776,6 @@
         <w:rPr>
           <w:rFonts w:hint="default" w:ascii="Times New Roman" w:hAnsi="Times New Roman" w:eastAsia="sans-serif" w:cs="Times New Roman"/>
           <w:color w:val="1F1F1F"/>
-          <w:bdr w:val="none" w:color="auto" w:sz="0" w:space="0"/>
         </w:rPr>
         <w:t xml:space="preserve">, </w:t>
       </w:r>
@@ -1858,7 +1784,6 @@
           <w:rStyle w:val="8"/>
           <w:rFonts w:hint="default" w:ascii="Times New Roman" w:hAnsi="Times New Roman" w:eastAsia="sans-serif" w:cs="Times New Roman"/>
           <w:color w:val="444746"/>
-          <w:bdr w:val="none" w:color="444746" w:sz="0" w:space="0"/>
         </w:rPr>
         <w:t>Ownership</w:t>
       </w:r>
@@ -1866,7 +1791,6 @@
         <w:rPr>
           <w:rFonts w:hint="default" w:ascii="Times New Roman" w:hAnsi="Times New Roman" w:eastAsia="sans-serif" w:cs="Times New Roman"/>
           <w:color w:val="1F1F1F"/>
-          <w:bdr w:val="none" w:color="auto" w:sz="0" w:space="0"/>
         </w:rPr>
         <w:t>) dựa trên luồng hoạt động này để Hoàng có thể bắt đầu code không?</w:t>
       </w:r>
@@ -2113,11 +2037,11 @@
     <w:lsdException w:unhideWhenUsed="0" w:uiPriority="0" w:semiHidden="0" w:name="Document Map"/>
     <w:lsdException w:unhideWhenUsed="0" w:uiPriority="0" w:semiHidden="0" w:name="Plain Text"/>
     <w:lsdException w:unhideWhenUsed="0" w:uiPriority="0" w:semiHidden="0" w:name="E-mail Signature"/>
-    <w:lsdException w:unhideWhenUsed="0" w:uiPriority="0" w:semiHidden="0" w:name="Normal (Web)"/>
+    <w:lsdException w:qFormat="1" w:unhideWhenUsed="0" w:uiPriority="0" w:semiHidden="0" w:name="Normal (Web)"/>
     <w:lsdException w:unhideWhenUsed="0" w:uiPriority="0" w:semiHidden="0" w:name="HTML Acronym"/>
     <w:lsdException w:unhideWhenUsed="0" w:uiPriority="0" w:semiHidden="0" w:name="HTML Address"/>
     <w:lsdException w:unhideWhenUsed="0" w:uiPriority="0" w:semiHidden="0" w:name="HTML Cite"/>
-    <w:lsdException w:unhideWhenUsed="0" w:uiPriority="0" w:semiHidden="0" w:name="HTML Code"/>
+    <w:lsdException w:qFormat="1" w:unhideWhenUsed="0" w:uiPriority="0" w:semiHidden="0" w:name="HTML Code"/>
     <w:lsdException w:unhideWhenUsed="0" w:uiPriority="0" w:semiHidden="0" w:name="HTML Definition"/>
     <w:lsdException w:unhideWhenUsed="0" w:uiPriority="0" w:semiHidden="0" w:name="HTML Keyboard"/>
     <w:lsdException w:unhideWhenUsed="0" w:uiPriority="0" w:semiHidden="0" w:name="HTML Preformatted"/>
@@ -2397,6 +2321,7 @@
   <w:style w:type="character" w:styleId="8">
     <w:name w:val="HTML Code"/>
     <w:basedOn w:val="6"/>
+    <w:qFormat/>
     <w:uiPriority w:val="0"/>
     <w:rPr>
       <w:rFonts w:ascii="Courier New" w:hAnsi="Courier New" w:cs="Courier New"/>
@@ -2406,6 +2331,7 @@
   </w:style>
   <w:style w:type="paragraph" w:styleId="9">
     <w:name w:val="Normal (Web)"/>
+    <w:qFormat/>
     <w:uiPriority w:val="0"/>
     <w:pPr>
       <w:spacing w:before="0" w:beforeAutospacing="1" w:after="0" w:afterAutospacing="1"/>
@@ -2413,6 +2339,7 @@
       <w:jc w:val="left"/>
     </w:pPr>
     <w:rPr>
+      <w:rFonts w:ascii="Times New Roman" w:hAnsi="Times New Roman" w:eastAsia="SimSun" w:cs="Times New Roman"/>
       <w:kern w:val="0"/>
       <w:sz w:val="24"/>
       <w:szCs w:val="24"/>
@@ -2439,6 +2366,7 @@
     <w:name w:val="Source Code"/>
     <w:basedOn w:val="1"/>
     <w:link w:val="13"/>
+    <w:qFormat/>
     <w:uiPriority w:val="0"/>
     <w:pPr>
       <w:wordWrap w:val="0"/>
@@ -2455,6 +2383,7 @@
     <w:name w:val="Body Text Char"/>
     <w:basedOn w:val="6"/>
     <w:link w:val="3"/>
+    <w:qFormat/>
     <w:uiPriority w:val="0"/>
   </w:style>
 </w:styles>

</xml_diff>